<commit_message>
feat(roadmap): larger map that scales to fill its pane
- main boxes 272x56, sub/detail 240x46, node type 15/14px, lane chips
  13px; the map was small next to the empty space around it
- RoadmapGraph grows the map to the width of its scroll pane
  (1x to 1.6x) with a transform on a wrapper, measured by a
  ResizeObserver; the exported PNG is still taken from the unscaled
  .graph, so downloads are unchanged
- docs: SYSTEM-GUIDE 6.7, report 4.5.2 and figure 4.17 refreshed
</commit_message>
<xml_diff>
--- a/docs/report/4.5-ai-features.docx
+++ b/docs/report/4.5-ai-features.docx
@@ -1422,7 +1422,7 @@
           <w:sz w:val="32"/>
           <w:szCs w:val="32"/>
         </w:rPr>
-        <w:t xml:space="preserve">) สำหรับอักษรละตินและตัวเลข และตกไปที่ IBM Plex Sans Thai สำหรับอักษรไทย หัวข้อหนา 800 ปุ่มหลักมีขอบล่าง 4 px ตามสเปก และคงเป็นธีมสว่างเสมอ (DESIGN.md ไม่มีโหมดมืด) สีที่เคยฝังในโค้ด (violet/sky) ถูกแทนด้วย </w:t>
+        <w:t xml:space="preserve">) สำหรับอักษรละตินและตัวเลข และตกไปที่ IBM Plex Sans Thai สำหรับอักษรไทย หัวข้อหนา 800 ปุ่มหลักมีขอบล่าง 4 px ตามสเปก และคงเป็นธีมสว่างเสมอ (DESIGN.md ไม่มีโหมดมืด): hook </w:t>
       </w:r>
       <w:r>
         <w:rPr>
@@ -1430,6 +1430,38 @@
           <w:sz w:val="24"/>
           <w:szCs w:val="24"/>
         </w:rPr>
+        <w:t xml:space="preserve">useForcedLightTheme()</w:t>
+      </w:r>
+      <w:r>
+        <w:rPr>
+          <w:rFonts w:ascii="TH Sarabun New" w:cs="TH Sarabun New" w:eastAsia="TH Sarabun New" w:hAnsi="TH Sarabun New"/>
+          <w:sz w:val="32"/>
+          <w:szCs w:val="32"/>
+        </w:rPr>
+        <w:t xml:space="preserve"> ถอด class </w:t>
+      </w:r>
+      <w:r>
+        <w:rPr>
+          <w:rFonts w:ascii="Courier New" w:cs="Courier New" w:eastAsia="Courier New" w:hAnsi="Courier New"/>
+          <w:sz w:val="24"/>
+          <w:szCs w:val="24"/>
+        </w:rPr>
+        <w:t xml:space="preserve">dark</w:t>
+      </w:r>
+      <w:r>
+        <w:rPr>
+          <w:rFonts w:ascii="TH Sarabun New" w:cs="TH Sarabun New" w:eastAsia="TH Sarabun New" w:hAnsi="TH Sarabun New"/>
+          <w:sz w:val="32"/>
+          <w:szCs w:val="32"/>
+        </w:rPr>
+        <w:t xml:space="preserve"> ของทั้งแอปออกตลอดเวลาที่หน้านี้เปิดอยู่และคืนค่าเมื่อออกจากหน้า เพราะเมื่อผู้ใช้เปิดโหมดมืดไว้ คอมโพเนนต์ที่ใช้ร่วมกับหน้าชุมชน (แถบหัว, ตัวแสดง Markdown, แผงประวัติ) จะใช้สีตัวอักษรของโหมดมืดบนพื้นขาวของธีมนี้จนอ่านไม่ออก (พบจากการใช้งานจริง) สีที่เคยฝังในโค้ด (violet/sky) ถูกแทนด้วย </w:t>
+      </w:r>
+      <w:r>
+        <w:rPr>
+          <w:rFonts w:ascii="Courier New" w:cs="Courier New" w:eastAsia="Courier New" w:hAnsi="Courier New"/>
+          <w:sz w:val="24"/>
+          <w:szCs w:val="24"/>
+        </w:rPr>
         <w:t xml:space="preserve">primary</w:t>
       </w:r>
       <w:r>
@@ -1438,7 +1470,7 @@
           <w:sz w:val="32"/>
           <w:szCs w:val="32"/>
         </w:rPr>
-        <w:t xml:space="preserve"> ทั้งหมด</w:t>
+        <w:t xml:space="preserve"> ในหน้านี้ และ map ผ่าน CSS สำหรับแผงที่ใช้ร่วมกัน</w:t>
       </w:r>
     </w:p>
     <w:p>
@@ -1876,10 +1908,10 @@
         </w:tblBorders>
       </w:tblPr>
       <w:tblGrid>
-        <w:gridCol w:w="1023"/>
-        <w:gridCol w:w="3004"/>
-        <w:gridCol w:w="3729"/>
-        <w:gridCol w:w="1316"/>
+        <w:gridCol w:w="998"/>
+        <w:gridCol w:w="2079"/>
+        <w:gridCol w:w="4997"/>
+        <w:gridCol w:w="998"/>
       </w:tblGrid>
       <w:tr>
         <w:trPr>
@@ -1888,7 +1920,7 @@
         </w:trPr>
         <w:tc>
           <w:tcPr>
-            <w:tcW w:type="dxa" w:w="1023"/>
+            <w:tcW w:type="dxa" w:w="998"/>
             <w:tcBorders>
               <w:top w:val="single" w:color="000000" w:sz="4"/>
               <w:left w:val="single" w:color="000000" w:sz="4"/>
@@ -1922,7 +1954,7 @@
         </w:tc>
         <w:tc>
           <w:tcPr>
-            <w:tcW w:type="dxa" w:w="3004"/>
+            <w:tcW w:type="dxa" w:w="2079"/>
             <w:tcBorders>
               <w:top w:val="single" w:color="000000" w:sz="4"/>
               <w:left w:val="single" w:color="000000" w:sz="4"/>
@@ -1956,7 +1988,7 @@
         </w:tc>
         <w:tc>
           <w:tcPr>
-            <w:tcW w:type="dxa" w:w="3729"/>
+            <w:tcW w:type="dxa" w:w="4997"/>
             <w:tcBorders>
               <w:top w:val="single" w:color="000000" w:sz="4"/>
               <w:left w:val="single" w:color="000000" w:sz="4"/>
@@ -1990,7 +2022,7 @@
         </w:tc>
         <w:tc>
           <w:tcPr>
-            <w:tcW w:type="dxa" w:w="1316"/>
+            <w:tcW w:type="dxa" w:w="998"/>
             <w:tcBorders>
               <w:top w:val="single" w:color="000000" w:sz="4"/>
               <w:left w:val="single" w:color="000000" w:sz="4"/>
@@ -2030,7 +2062,7 @@
         </w:trPr>
         <w:tc>
           <w:tcPr>
-            <w:tcW w:type="dxa" w:w="1023"/>
+            <w:tcW w:type="dxa" w:w="998"/>
             <w:tcBorders>
               <w:top w:val="single" w:color="000000" w:sz="4"/>
               <w:left w:val="single" w:color="000000" w:sz="4"/>
@@ -2061,7 +2093,7 @@
         </w:tc>
         <w:tc>
           <w:tcPr>
-            <w:tcW w:type="dxa" w:w="3004"/>
+            <w:tcW w:type="dxa" w:w="2079"/>
             <w:tcBorders>
               <w:top w:val="single" w:color="000000" w:sz="4"/>
               <w:left w:val="single" w:color="000000" w:sz="4"/>
@@ -2108,7 +2140,7 @@
         </w:tc>
         <w:tc>
           <w:tcPr>
-            <w:tcW w:type="dxa" w:w="3729"/>
+            <w:tcW w:type="dxa" w:w="4997"/>
             <w:tcBorders>
               <w:top w:val="single" w:color="000000" w:sz="4"/>
               <w:left w:val="single" w:color="000000" w:sz="4"/>
@@ -2179,7 +2211,7 @@
         </w:tc>
         <w:tc>
           <w:tcPr>
-            <w:tcW w:type="dxa" w:w="1316"/>
+            <w:tcW w:type="dxa" w:w="998"/>
             <w:tcBorders>
               <w:top w:val="single" w:color="000000" w:sz="4"/>
               <w:left w:val="single" w:color="000000" w:sz="4"/>
@@ -2232,7 +2264,7 @@
         </w:trPr>
         <w:tc>
           <w:tcPr>
-            <w:tcW w:type="dxa" w:w="1023"/>
+            <w:tcW w:type="dxa" w:w="998"/>
             <w:tcBorders>
               <w:top w:val="single" w:color="000000" w:sz="4"/>
               <w:left w:val="single" w:color="000000" w:sz="4"/>
@@ -2263,7 +2295,7 @@
         </w:tc>
         <w:tc>
           <w:tcPr>
-            <w:tcW w:type="dxa" w:w="3004"/>
+            <w:tcW w:type="dxa" w:w="2079"/>
             <w:tcBorders>
               <w:top w:val="single" w:color="000000" w:sz="4"/>
               <w:left w:val="single" w:color="000000" w:sz="4"/>
@@ -2310,7 +2342,7 @@
         </w:tc>
         <w:tc>
           <w:tcPr>
-            <w:tcW w:type="dxa" w:w="3729"/>
+            <w:tcW w:type="dxa" w:w="4997"/>
             <w:tcBorders>
               <w:top w:val="single" w:color="000000" w:sz="4"/>
               <w:left w:val="single" w:color="000000" w:sz="4"/>
@@ -2373,7 +2405,7 @@
         </w:tc>
         <w:tc>
           <w:tcPr>
-            <w:tcW w:type="dxa" w:w="1316"/>
+            <w:tcW w:type="dxa" w:w="998"/>
             <w:tcBorders>
               <w:top w:val="single" w:color="000000" w:sz="4"/>
               <w:left w:val="single" w:color="000000" w:sz="4"/>
@@ -2410,7 +2442,7 @@
         </w:trPr>
         <w:tc>
           <w:tcPr>
-            <w:tcW w:type="dxa" w:w="1023"/>
+            <w:tcW w:type="dxa" w:w="998"/>
             <w:tcBorders>
               <w:top w:val="single" w:color="000000" w:sz="4"/>
               <w:left w:val="single" w:color="000000" w:sz="4"/>
@@ -2441,7 +2473,7 @@
         </w:tc>
         <w:tc>
           <w:tcPr>
-            <w:tcW w:type="dxa" w:w="3004"/>
+            <w:tcW w:type="dxa" w:w="2079"/>
             <w:tcBorders>
               <w:top w:val="single" w:color="000000" w:sz="4"/>
               <w:left w:val="single" w:color="000000" w:sz="4"/>
@@ -2504,7 +2536,7 @@
         </w:tc>
         <w:tc>
           <w:tcPr>
-            <w:tcW w:type="dxa" w:w="3729"/>
+            <w:tcW w:type="dxa" w:w="4997"/>
             <w:tcBorders>
               <w:top w:val="single" w:color="000000" w:sz="4"/>
               <w:left w:val="single" w:color="000000" w:sz="4"/>
@@ -2545,13 +2577,13 @@
                 <w:sz w:val="28"/>
                 <w:szCs w:val="28"/>
               </w:rPr>
-              <w:t xml:space="preserve"> (ตารางที่ 4.40) ฟอนต์ Nunito → IBM Plex Sans Thai หัวข้อหนา 800 ปุ่มหลักขอบล่าง 4 px ยุบเมื่อกด ด่านที่เลือกเป็นชมพูทึบ เส้นแตกด่านเป็นเส้นประชมพู ป้ายชื่อเลนเป็นชิป และ PNG เป็นพื้นขาว</w:t>
-            </w:r>
-          </w:p>
-        </w:tc>
-        <w:tc>
-          <w:tcPr>
-            <w:tcW w:type="dxa" w:w="1316"/>
+              <w:t xml:space="preserve"> (ตารางที่ 4.40) ฟอนต์ Nunito → IBM Plex Sans Thai หัวข้อหนา 800 ปุ่มหลักขอบล่าง 4 px ยุบเมื่อกด ด่านที่เลือกเป็นชมพูทึบ เส้นแตกด่านเป็นเส้นประชมพู ป้ายชื่อเลนเป็นชิป และ PNG เป็นพื้นขาว; จากการทดลองใช้พบว่ากราฟเล็กเกินไปเมื่อเทียบกับพื้นที่ว่าง จึงขยายกล่องด่าน (หลัก 272×56 px ย่อย 240×46 px) และให้กราฟขยายอัตโนมัติจนเต็มความกว้างของพื้นที่ (1–1.6 เท่า) โดยคงรูป PNG ที่ส่งออกไว้ที่ขนาด 1:1</w:t>
+            </w:r>
+          </w:p>
+        </w:tc>
+        <w:tc>
+          <w:tcPr>
+            <w:tcW w:type="dxa" w:w="998"/>
             <w:tcBorders>
               <w:top w:val="single" w:color="000000" w:sz="4"/>
               <w:left w:val="single" w:color="000000" w:sz="4"/>
@@ -4487,7 +4519,7 @@
       <w:r>
         <w:drawing>
           <wp:inline distT="0" distB="0" distL="0" distR="0">
-            <wp:extent cx="4324350" cy="2857500"/>
+            <wp:extent cx="4324350" cy="3514725"/>
             <wp:effectExtent t="0" r="0" b="0" l="0"/>
             <wp:docPr id="1" name="แผนการเรียนที่ขยายด่านแล้วในธีม SIET Pink" descr="แผนการเรียนที่ขยายด่านแล้วในธีม SIET Pink" title="แผนการเรียนที่ขยายด่านแล้วในธีม SIET Pink"/>
             <wp:cNvGraphicFramePr>
@@ -4512,7 +4544,7 @@
                   <pic:spPr bwMode="auto">
                     <a:xfrm>
                       <a:off x="0" y="0"/>
-                      <a:ext cx="4324350" cy="2857500"/>
+                      <a:ext cx="4324350" cy="3514725"/>
                     </a:xfrm>
                     <a:prstGeom prst="rect">
                       <a:avLst/>

</xml_diff>